<commit_message>
Rebuild report on exact PTIT template, restore math and audit slides and data lineage
</commit_message>
<xml_diff>
--- a/reports/presentation_final/Goi_y_thuyet_trinh_TPOUR_TRPO.docx
+++ b/reports/presentation_final/Goi_y_thuyet_trinh_TPOUR_TRPO.docx
@@ -12,7 +12,7 @@
     </w:p>
     <w:p>
       <w:r>
-        <w:t>Slide 1–19: phần trình bày chính khoảng 12–15 phút. Slide 20–23: mở khi cần hỏi đáp. Đây là gợi ý để nói bằng lời của mình, không cần đọc nguyên văn.</w:t>
+        <w:t>Slide 1–21: phần trình bày chính khoảng 14–17 phút. Slide 22–27: mở khi cần hỏi đáp. Đây là gợi ý để nói bằng lời của mình, không cần đọc nguyên văn.</w:t>
       </w:r>
     </w:p>
     <w:p>
@@ -30,7 +30,7 @@
     </w:p>
     <w:p>
       <w:r>
-        <w:t>Mở đầu: Nhóm tìm hiểu truy xuất thông tin có yếu tố thời gian. Em trình bày phương pháp của bài báo, phần nhóm đã triển khai và một biến thể giữ kiến thức đã được kiểm chứng. Kết quả có lợi trên SciFact so với TRPO nhưng còn đánh đổi. Thời lượng gợi ý 12–15 phút cho slide 1–19; slide 20–23 dùng khi hỏi.</w:t>
+        <w:t>Mở đầu: Nhóm tìm hiểu truy xuất thông tin có yếu tố thời gian. Em trình bày phương pháp của bài báo, phần nhóm đã triển khai và một biến thể giữ kiến thức đã được kiểm chứng. Kết quả có lợi trên SciFact so với TRPO nhưng còn đánh đổi. Thời lượng gợi ý 12–15 phút cho slide 1–21; slide 22–27 dùng khi hỏi.</w:t>
       </w:r>
     </w:p>
     <w:p>
@@ -64,7 +64,33 @@
         <w:pStyle w:val="Heading2"/>
       </w:pPr>
       <w:r>
-        <w:t>04. 3. Nhóm đã làm đến đâu?</w:t>
+        <w:t>04. Công thức nền: CE và TRPO</w:t>
+      </w:r>
+    </w:p>
+    <w:p>
+      <w:r>
+        <w:t>s là dot product chưa chia nhiệt độ; Δ là chênh lệch score đã chia T. CE hiển thị cho một query, code trung bình theo batch. k_j là negative key reference trong queue. TRPO có reference gap detach và β=0,3, T=0,05. Khi hai gap bằng nhau, loss ln2 nhưng gradient student chưa bằng0. Đây là công thức bản gọn đối chiếu mục3.1, không phải weighted KL hoặc PPO.</w:t>
+      </w:r>
+    </w:p>
+    <w:p>
+      <w:pPr>
+        <w:pStyle w:val="Heading2"/>
+      </w:pPr>
+      <w:r>
+        <w:t>05. Time vector: nội dung của bài báo, chưa tái lập đủ</w:t>
+      </w:r>
+    </w:p>
+    <w:p>
+      <w:r>
+        <w:t>Nội suy trọng số giữa hai encoder chuyên biệt thời gian cùng nền, không phải chèn year embedding vào query. Hai checkpoint toy từng nội suy chỉ là kiểm tra thao tác tensor, không đại diện 2018 và2021. Điều kiện là cùng kiến trúc, pretrained base, tokenizer và metadata tương thích. Phải mã hóa lại corpus sau khi đổi encoder; nhóm chưa kiểm chứng chất lượng nội suy trên temporal gold.</w:t>
+      </w:r>
+    </w:p>
+    <w:p>
+      <w:pPr>
+        <w:pStyle w:val="Heading2"/>
+      </w:pPr>
+      <w:r>
+        <w:t>06. 3. Nhóm đã làm đến đâu?</w:t>
       </w:r>
     </w:p>
     <w:p>
@@ -77,7 +103,7 @@
         <w:pStyle w:val="Heading2"/>
       </w:pPr>
       <w:r>
-        <w:t>05. 4. Dữ liệu: đã thay mock bằng mẫu thật</w:t>
+        <w:t>07. 4. Dữ liệu: đã thay mock bằng mẫu thật</w:t>
       </w:r>
     </w:p>
     <w:p>
@@ -90,7 +116,7 @@
         <w:pStyle w:val="Heading2"/>
       </w:pPr>
       <w:r>
-        <w:t>06. 5. Từ TPOUR gọn đến biến thể retention</w:t>
+        <w:t>08. 5. Từ TPOUR gọn đến biến thể retention</w:t>
       </w:r>
     </w:p>
     <w:p>
@@ -103,7 +129,7 @@
         <w:pStyle w:val="Heading2"/>
       </w:pPr>
       <w:r>
-        <w:t>07. 6. Vì sao nhóm thêm teacher cố định?</w:t>
+        <w:t>09. 6. Vì sao nhóm thêm teacher cố định?</w:t>
       </w:r>
     </w:p>
     <w:p>
@@ -116,7 +142,7 @@
         <w:pStyle w:val="Heading2"/>
       </w:pPr>
       <w:r>
-        <w:t>08. 7. Nhóm thay đổi hàm mục tiêu thế nào?</w:t>
+        <w:t>10. 7. Nhóm thay đổi hàm mục tiêu thế nào?</w:t>
       </w:r>
     </w:p>
     <w:p>
@@ -129,7 +155,7 @@
         <w:pStyle w:val="Heading2"/>
       </w:pPr>
       <w:r>
-        <w:t>09. 8. Một bước train và một lần truy xuất</w:t>
+        <w:t>11. 8. Một bước train và một lần truy xuất</w:t>
       </w:r>
     </w:p>
     <w:p>
@@ -142,7 +168,7 @@
         <w:pStyle w:val="Heading2"/>
       </w:pPr>
       <w:r>
-        <w:t>10. 9. Thiết kế đối chứng trên Kaggle</w:t>
+        <w:t>12. 9. Thiết kế đối chứng trên Kaggle</w:t>
       </w:r>
     </w:p>
     <w:p>
@@ -155,7 +181,7 @@
         <w:pStyle w:val="Heading2"/>
       </w:pPr>
       <w:r>
-        <w:t>11. 10. Kết quả: giảm suy giảm so với TRPO</w:t>
+        <w:t>13. 10. Kết quả: giảm suy giảm so với TRPO</w:t>
       </w:r>
     </w:p>
     <w:p>
@@ -168,7 +194,7 @@
         <w:pStyle w:val="Heading2"/>
       </w:pPr>
       <w:r>
-        <w:t>12. 11. Kết quả có lặp lại qua các seed không?</w:t>
+        <w:t>14. 11. Kết quả có lặp lại qua các seed không?</w:t>
       </w:r>
     </w:p>
     <w:p>
@@ -181,7 +207,7 @@
         <w:pStyle w:val="Heading2"/>
       </w:pPr>
       <w:r>
-        <w:t>13. 12. Đánh đổi: preference proxy giảm</w:t>
+        <w:t>15. 12. Đánh đổi: preference proxy giảm</w:t>
       </w:r>
     </w:p>
     <w:p>
@@ -194,7 +220,7 @@
         <w:pStyle w:val="Heading2"/>
       </w:pPr>
       <w:r>
-        <w:t>14. 13. Ablation và chi phí: chưa phải mọi phần đều tốt</w:t>
+        <w:t>16. 13. Ablation và chi phí: chưa phải mọi phần đều tốt</w:t>
       </w:r>
     </w:p>
     <w:p>
@@ -207,7 +233,7 @@
         <w:pStyle w:val="Heading2"/>
       </w:pPr>
       <w:r>
-        <w:t>15. 14. Demo checkpoint: đã chạy inference thật</w:t>
+        <w:t>17. 14. Demo checkpoint: đã chạy inference thật</w:t>
       </w:r>
     </w:p>
     <w:p>
@@ -220,7 +246,7 @@
         <w:pStyle w:val="Heading2"/>
       </w:pPr>
       <w:r>
-        <w:t>16. 15. Demo tốt và xấu đều phải trình bày</w:t>
+        <w:t>18. 15. Demo tốt và xấu đều phải trình bày</w:t>
       </w:r>
     </w:p>
     <w:p>
@@ -233,7 +259,7 @@
         <w:pStyle w:val="Heading2"/>
       </w:pPr>
       <w:r>
-        <w:t>17. 16. Đóng góp và phần chưa hoàn tất</w:t>
+        <w:t>19. 16. Đóng góp và phần chưa hoàn tất</w:t>
       </w:r>
     </w:p>
     <w:p>
@@ -246,7 +272,7 @@
         <w:pStyle w:val="Heading2"/>
       </w:pPr>
       <w:r>
-        <w:t>18. 17. Hướng tiếp theo: kiểm tra đúng mục tiêu trước</w:t>
+        <w:t>20. 17. Hướng tiếp theo: kiểm tra đúng mục tiêu trước</w:t>
       </w:r>
     </w:p>
     <w:p>
@@ -259,7 +285,7 @@
         <w:pStyle w:val="Heading2"/>
       </w:pPr>
       <w:r>
-        <w:t>19. 18. Kết luận</w:t>
+        <w:t>21. 18. Kết luận</w:t>
       </w:r>
     </w:p>
     <w:p>
@@ -272,7 +298,7 @@
         <w:pStyle w:val="Heading2"/>
       </w:pPr>
       <w:r>
-        <w:t>20. Hỏi đáp · Vì sao có cả reference và teacher? [phụ lục]</w:t>
+        <w:t>22. Hỏi đáp · Vì sao có cả reference và teacher? [phụ lục]</w:t>
       </w:r>
     </w:p>
     <w:p>
@@ -285,7 +311,7 @@
         <w:pStyle w:val="Heading2"/>
       </w:pPr>
       <w:r>
-        <w:t>21. Hỏi đáp · Chưa vượt baseline thì có ý nghĩa gì? [phụ lục]</w:t>
+        <w:t>23. Hỏi đáp · Chưa vượt baseline thì có ý nghĩa gì? [phụ lục]</w:t>
       </w:r>
     </w:p>
     <w:p>
@@ -298,7 +324,7 @@
         <w:pStyle w:val="Heading2"/>
       </w:pPr>
       <w:r>
-        <w:t>22. Hỏi đáp · Demo thế nào khi thuyết trình? [phụ lục]</w:t>
+        <w:t>24. Hỏi đáp · Demo thế nào khi thuyết trình? [phụ lục]</w:t>
       </w:r>
     </w:p>
     <w:p>
@@ -311,12 +337,38 @@
         <w:pStyle w:val="Heading2"/>
       </w:pPr>
       <w:r>
-        <w:t>23. Nguồn để đối chiếu [phụ lục]</w:t>
+        <w:t>25. Hỏi đáp · KL và relative MSE tính trên gì? [phụ lục]</w:t>
       </w:r>
     </w:p>
     <w:p>
       <w:r>
-        <w:t>Tài liệu gốc nằm trong repo, cùng PDF đã chọn. Notebook Kaggle có thể cần quyền tài khoản; JSON/log/notebook source công khai trong GitHub cho phép đọc bằng chứng. Slide 1–19 là phần trình bày chính; 20–23 là phụ lục.</w:t>
+        <w:t>Đây là công thức chính xác theo anchored_tpour.retention_loss. B query;2B preferred/rejected trong batch;3B embedding gồm query/preferred/rejected. KL(teacher||student) lấy batchmean; MSE tương đối lấy mean3B. Cùng input augmentation, teacher detach. Tr=0,1; epsilon=1e-6. Không có nhãn qrels test hoặc dữ liệu truy xuất ngoài batch đưa vào hai hạng này.</w:t>
+      </w:r>
+    </w:p>
+    <w:p>
+      <w:pPr>
+        <w:pStyle w:val="Heading2"/>
+      </w:pPr>
+      <w:r>
+        <w:t>26. Hỏi đáp · Có dùng context ngoài vào train không? [phụ lục]</w:t>
+      </w:r>
+    </w:p>
+    <w:p>
+      <w:r>
+        <w:t>Rà code và provenance:train đọc train.jsonl xuất từ mẫu tác giả; queue và teacher targets tạo trên cùng dữ liệu đó. SciFact corpus/query/qrels là nguồn đánh giá riêng. Demo chỉ truy xuất corpus SciFact, không gọi web search hay LLM sinh context. Chỉ khẳng định pipeline đã rà soát; chưa thể kiểm toán toàn bộ dữ liệu tiền huấn luyện hoặc mọi trùng ngữ nghĩa. SciFact đã được xem khi thiết kế retention nên vẫn có design bias.</w:t>
+      </w:r>
+    </w:p>
+    <w:p>
+      <w:pPr>
+        <w:pStyle w:val="Heading2"/>
+      </w:pPr>
+      <w:r>
+        <w:t>27. Nguồn để đối chiếu [phụ lục]</w:t>
+      </w:r>
+    </w:p>
+    <w:p>
+      <w:r>
+        <w:t>Tài liệu gốc nằm trong repo, cùng PDF đã chọn. Notebook Kaggle có thể cần quyền tài khoản; JSON/log/notebook source công khai trong GitHub cho phép đọc bằng chứng. Slide 1–21 là phần trình bày chính; 22–27 là phụ lục.</w:t>
       </w:r>
     </w:p>
     <w:p>

</xml_diff>